<commit_message>
idk what changed tbh
</commit_message>
<xml_diff>
--- a/src/assets/Resume25-26.docx
+++ b/src/assets/Resume25-26.docx
@@ -1432,7 +1432,7 @@
           <w:sz w:val="24"/>
           <w:szCs w:val="24"/>
         </w:rPr>
-        <w:t>4</w:t>
+        <w:t>3</w:t>
       </w:r>
       <w:r>
         <w:rPr>
@@ -1717,7 +1717,43 @@
           <w:sz w:val="24"/>
           <w:szCs w:val="24"/>
         </w:rPr>
-        <w:t>Fall 2023 &amp; Fall 2022</w:t>
+        <w:t>Fall 202</w:t>
+      </w:r>
+      <w:r>
+        <w:rPr>
+          <w:rFonts w:ascii="Times New Roman" w:eastAsia="Times New Roman" w:hAnsi="Times New Roman" w:cs="Times New Roman"/>
+          <w:b/>
+          <w:bCs/>
+          <w:color w:val="000000"/>
+          <w:kern w:val="36"/>
+          <w:sz w:val="24"/>
+          <w:szCs w:val="24"/>
+        </w:rPr>
+        <w:t>2</w:t>
+      </w:r>
+      <w:r>
+        <w:rPr>
+          <w:rFonts w:ascii="Times New Roman" w:eastAsia="Times New Roman" w:hAnsi="Times New Roman" w:cs="Times New Roman"/>
+          <w:b/>
+          <w:bCs/>
+          <w:color w:val="000000"/>
+          <w:kern w:val="36"/>
+          <w:sz w:val="24"/>
+          <w:szCs w:val="24"/>
+        </w:rPr>
+        <w:t xml:space="preserve"> &amp; Fall 202</w:t>
+      </w:r>
+      <w:r>
+        <w:rPr>
+          <w:rFonts w:ascii="Times New Roman" w:eastAsia="Times New Roman" w:hAnsi="Times New Roman" w:cs="Times New Roman"/>
+          <w:b/>
+          <w:bCs/>
+          <w:color w:val="000000"/>
+          <w:kern w:val="36"/>
+          <w:sz w:val="24"/>
+          <w:szCs w:val="24"/>
+        </w:rPr>
+        <w:t>3</w:t>
       </w:r>
     </w:p>
     <w:p>

</xml_diff>

<commit_message>
fixed a bunch of typos
</commit_message>
<xml_diff>
--- a/src/assets/Resume25-26.docx
+++ b/src/assets/Resume25-26.docx
@@ -76,19 +76,29 @@
                                 <w:szCs w:val="20"/>
                               </w:rPr>
                             </w:pPr>
-                            <w:hyperlink r:id="rId5" w:history="1">
-                              <w:r>
-                                <w:rPr>
-                                  <w:rStyle w:val="Hyperlink"/>
-                                  <w:rFonts w:ascii="Times New Roman" w:hAnsi="Times New Roman" w:cs="Times New Roman"/>
-                                  <w:color w:val="000000" w:themeColor="text1"/>
-                                  <w:sz w:val="20"/>
-                                  <w:szCs w:val="20"/>
-                                  <w:u w:val="none"/>
-                                </w:rPr>
-                                <w:t>tjlayton2@gmail.com</w:t>
-                              </w:r>
-                            </w:hyperlink>
+                            <w:r>
+                              <w:fldChar w:fldCharType="begin"/>
+                            </w:r>
+                            <w:r>
+                              <w:instrText>HYPERLINK "mailto:tjlayton2@gmail.com"</w:instrText>
+                            </w:r>
+                            <w:r>
+                              <w:fldChar w:fldCharType="separate"/>
+                            </w:r>
+                            <w:r>
+                              <w:rPr>
+                                <w:rStyle w:val="Hyperlink"/>
+                                <w:rFonts w:ascii="Times New Roman" w:hAnsi="Times New Roman" w:cs="Times New Roman"/>
+                                <w:color w:val="000000" w:themeColor="text1"/>
+                                <w:sz w:val="20"/>
+                                <w:szCs w:val="20"/>
+                                <w:u w:val="none"/>
+                              </w:rPr>
+                              <w:t>tjlayton2@gmail.com</w:t>
+                            </w:r>
+                            <w:r>
+                              <w:fldChar w:fldCharType="end"/>
+                            </w:r>
                             <w:r>
                               <w:rPr>
                                 <w:rFonts w:ascii="Times New Roman" w:hAnsi="Times New Roman" w:cs="Times New Roman"/>
@@ -116,7 +126,8 @@
                               </w:rPr>
                               <w:t xml:space="preserve">           </w:t>
                             </w:r>
-                            <w:hyperlink r:id="rId6" w:history="1">
+                            <w:hyperlink r:id="rId5" w:history="1">
+                              <w:proofErr w:type="spellStart"/>
                               <w:r>
                                 <w:rPr>
                                   <w:rStyle w:val="Hyperlink"/>
@@ -125,7 +136,18 @@
                                   <w:sz w:val="20"/>
                                   <w:szCs w:val="20"/>
                                 </w:rPr>
-                                <w:t>Linkedin: tyler-layton977a38249</w:t>
+                                <w:t>Linkedin</w:t>
+                              </w:r>
+                              <w:proofErr w:type="spellEnd"/>
+                              <w:r>
+                                <w:rPr>
+                                  <w:rStyle w:val="Hyperlink"/>
+                                  <w:rFonts w:ascii="Times New Roman" w:hAnsi="Times New Roman" w:cs="Times New Roman"/>
+                                  <w:color w:val="000000"/>
+                                  <w:sz w:val="20"/>
+                                  <w:szCs w:val="20"/>
+                                </w:rPr>
+                                <w:t>: tyler-layton977a38249</w:t>
                               </w:r>
                             </w:hyperlink>
                           </w:p>
@@ -156,7 +178,34 @@
                                 <w:szCs w:val="20"/>
                                 <w:u w:val="single"/>
                               </w:rPr>
-                              <w:t>tylerlayton.xyz</w:t>
+                              <w:t>t</w:t>
+                            </w:r>
+                            <w:r>
+                              <w:rPr>
+                                <w:rFonts w:ascii="Times New Roman" w:hAnsi="Times New Roman" w:cs="Times New Roman"/>
+                                <w:sz w:val="20"/>
+                                <w:szCs w:val="20"/>
+                                <w:u w:val="single"/>
+                              </w:rPr>
+                              <w:t>j</w:t>
+                            </w:r>
+                            <w:r>
+                              <w:rPr>
+                                <w:rFonts w:ascii="Times New Roman" w:hAnsi="Times New Roman" w:cs="Times New Roman"/>
+                                <w:sz w:val="20"/>
+                                <w:szCs w:val="20"/>
+                                <w:u w:val="single"/>
+                              </w:rPr>
+                              <w:t>layton.</w:t>
+                            </w:r>
+                            <w:r>
+                              <w:rPr>
+                                <w:rFonts w:ascii="Times New Roman" w:hAnsi="Times New Roman" w:cs="Times New Roman"/>
+                                <w:sz w:val="20"/>
+                                <w:szCs w:val="20"/>
+                                <w:u w:val="single"/>
+                              </w:rPr>
+                              <w:t>com</w:t>
                             </w:r>
                           </w:p>
                           <w:p>
@@ -215,19 +264,29 @@
                           <w:szCs w:val="20"/>
                         </w:rPr>
                       </w:pPr>
-                      <w:hyperlink r:id="rId7" w:history="1">
-                        <w:r>
-                          <w:rPr>
-                            <w:rStyle w:val="Hyperlink"/>
-                            <w:rFonts w:ascii="Times New Roman" w:hAnsi="Times New Roman" w:cs="Times New Roman"/>
-                            <w:color w:val="000000" w:themeColor="text1"/>
-                            <w:sz w:val="20"/>
-                            <w:szCs w:val="20"/>
-                            <w:u w:val="none"/>
-                          </w:rPr>
-                          <w:t>tjlayton2@gmail.com</w:t>
-                        </w:r>
-                      </w:hyperlink>
+                      <w:r>
+                        <w:fldChar w:fldCharType="begin"/>
+                      </w:r>
+                      <w:r>
+                        <w:instrText>HYPERLINK "mailto:tjlayton2@gmail.com"</w:instrText>
+                      </w:r>
+                      <w:r>
+                        <w:fldChar w:fldCharType="separate"/>
+                      </w:r>
+                      <w:r>
+                        <w:rPr>
+                          <w:rStyle w:val="Hyperlink"/>
+                          <w:rFonts w:ascii="Times New Roman" w:hAnsi="Times New Roman" w:cs="Times New Roman"/>
+                          <w:color w:val="000000" w:themeColor="text1"/>
+                          <w:sz w:val="20"/>
+                          <w:szCs w:val="20"/>
+                          <w:u w:val="none"/>
+                        </w:rPr>
+                        <w:t>tjlayton2@gmail.com</w:t>
+                      </w:r>
+                      <w:r>
+                        <w:fldChar w:fldCharType="end"/>
+                      </w:r>
                       <w:r>
                         <w:rPr>
                           <w:rFonts w:ascii="Times New Roman" w:hAnsi="Times New Roman" w:cs="Times New Roman"/>
@@ -255,7 +314,8 @@
                         </w:rPr>
                         <w:t xml:space="preserve">           </w:t>
                       </w:r>
-                      <w:hyperlink r:id="rId8" w:history="1">
+                      <w:hyperlink r:id="rId6" w:history="1">
+                        <w:proofErr w:type="spellStart"/>
                         <w:r>
                           <w:rPr>
                             <w:rStyle w:val="Hyperlink"/>
@@ -264,7 +324,18 @@
                             <w:sz w:val="20"/>
                             <w:szCs w:val="20"/>
                           </w:rPr>
-                          <w:t>Linkedin: tyler-layton977a38249</w:t>
+                          <w:t>Linkedin</w:t>
+                        </w:r>
+                        <w:proofErr w:type="spellEnd"/>
+                        <w:r>
+                          <w:rPr>
+                            <w:rStyle w:val="Hyperlink"/>
+                            <w:rFonts w:ascii="Times New Roman" w:hAnsi="Times New Roman" w:cs="Times New Roman"/>
+                            <w:color w:val="000000"/>
+                            <w:sz w:val="20"/>
+                            <w:szCs w:val="20"/>
+                          </w:rPr>
+                          <w:t>: tyler-layton977a38249</w:t>
                         </w:r>
                       </w:hyperlink>
                     </w:p>
@@ -295,7 +366,34 @@
                           <w:szCs w:val="20"/>
                           <w:u w:val="single"/>
                         </w:rPr>
-                        <w:t>tylerlayton.xyz</w:t>
+                        <w:t>t</w:t>
+                      </w:r>
+                      <w:r>
+                        <w:rPr>
+                          <w:rFonts w:ascii="Times New Roman" w:hAnsi="Times New Roman" w:cs="Times New Roman"/>
+                          <w:sz w:val="20"/>
+                          <w:szCs w:val="20"/>
+                          <w:u w:val="single"/>
+                        </w:rPr>
+                        <w:t>j</w:t>
+                      </w:r>
+                      <w:r>
+                        <w:rPr>
+                          <w:rFonts w:ascii="Times New Roman" w:hAnsi="Times New Roman" w:cs="Times New Roman"/>
+                          <w:sz w:val="20"/>
+                          <w:szCs w:val="20"/>
+                          <w:u w:val="single"/>
+                        </w:rPr>
+                        <w:t>layton.</w:t>
+                      </w:r>
+                      <w:r>
+                        <w:rPr>
+                          <w:rFonts w:ascii="Times New Roman" w:hAnsi="Times New Roman" w:cs="Times New Roman"/>
+                          <w:sz w:val="20"/>
+                          <w:szCs w:val="20"/>
+                          <w:u w:val="single"/>
+                        </w:rPr>
+                        <w:t>com</w:t>
                       </w:r>
                     </w:p>
                     <w:p>
@@ -1199,7 +1297,21 @@
           <w:rFonts w:ascii="Times New Roman" w:eastAsia="Times New Roman" w:hAnsi="Times New Roman" w:cs="Times New Roman"/>
           <w:color w:val="000000"/>
         </w:rPr>
-        <w:t xml:space="preserve">Worked with a team of 5 other students </w:t>
+        <w:t xml:space="preserve">Worked with a team of </w:t>
+      </w:r>
+      <w:r>
+        <w:rPr>
+          <w:rFonts w:ascii="Times New Roman" w:eastAsia="Times New Roman" w:hAnsi="Times New Roman" w:cs="Times New Roman"/>
+          <w:color w:val="000000"/>
+        </w:rPr>
+        <w:t>five</w:t>
+      </w:r>
+      <w:r>
+        <w:rPr>
+          <w:rFonts w:ascii="Times New Roman" w:eastAsia="Times New Roman" w:hAnsi="Times New Roman" w:cs="Times New Roman"/>
+          <w:color w:val="000000"/>
+        </w:rPr>
+        <w:t xml:space="preserve"> other students </w:t>
       </w:r>
       <w:r>
         <w:rPr>
@@ -1584,7 +1696,25 @@
           <w:color w:val="000000"/>
           <w:kern w:val="36"/>
         </w:rPr>
-        <w:t xml:space="preserve"> in Python with Tkinter for creating and managing Jenkins files, reducing file authoring time by 80%.</w:t>
+        <w:t xml:space="preserve"> in Python with </w:t>
+      </w:r>
+      <w:proofErr w:type="spellStart"/>
+      <w:r>
+        <w:rPr>
+          <w:rFonts w:ascii="Times New Roman" w:eastAsia="Times New Roman" w:hAnsi="Times New Roman" w:cs="Times New Roman"/>
+          <w:color w:val="000000"/>
+          <w:kern w:val="36"/>
+        </w:rPr>
+        <w:t>Tkinter</w:t>
+      </w:r>
+      <w:proofErr w:type="spellEnd"/>
+      <w:r>
+        <w:rPr>
+          <w:rFonts w:ascii="Times New Roman" w:eastAsia="Times New Roman" w:hAnsi="Times New Roman" w:cs="Times New Roman"/>
+          <w:color w:val="000000"/>
+          <w:kern w:val="36"/>
+        </w:rPr>
+        <w:t xml:space="preserve"> for creating and managing Jenkins files, reducing file authoring time by 80%.</w:t>
       </w:r>
     </w:p>
     <w:p>
@@ -1773,7 +1903,27 @@
           <w:iCs/>
           <w:color w:val="000000"/>
         </w:rPr>
-        <w:t xml:space="preserve">Rensselaer Center for Open Source (RCOS)                                                                </w:t>
+        <w:t>Rensselaer Center for Open Source (</w:t>
+      </w:r>
+      <w:proofErr w:type="gramStart"/>
+      <w:r>
+        <w:rPr>
+          <w:rFonts w:ascii="Times New Roman" w:eastAsia="Times New Roman" w:hAnsi="Times New Roman" w:cs="Times New Roman"/>
+          <w:i/>
+          <w:iCs/>
+          <w:color w:val="000000"/>
+        </w:rPr>
+        <w:t xml:space="preserve">RCOS)   </w:t>
+      </w:r>
+      <w:proofErr w:type="gramEnd"/>
+      <w:r>
+        <w:rPr>
+          <w:rFonts w:ascii="Times New Roman" w:eastAsia="Times New Roman" w:hAnsi="Times New Roman" w:cs="Times New Roman"/>
+          <w:i/>
+          <w:iCs/>
+          <w:color w:val="000000"/>
+        </w:rPr>
+        <w:t xml:space="preserve">                                                             </w:t>
       </w:r>
       <w:r>
         <w:rPr>
@@ -1812,7 +1962,23 @@
           <w:rFonts w:ascii="Times New Roman" w:eastAsia="Times New Roman" w:hAnsi="Times New Roman" w:cs="Times New Roman"/>
           <w:color w:val="000000"/>
         </w:rPr>
-        <w:t>Led and contributed to open-source projects supporting student learning, including an educational analog circuit simulator and a Python-based platformer game using Pygame.</w:t>
+        <w:t xml:space="preserve">Led and contributed to open-source projects supporting student learning, including an educational analog circuit simulator and a Python-based platformer game using </w:t>
+      </w:r>
+      <w:proofErr w:type="spellStart"/>
+      <w:r>
+        <w:rPr>
+          <w:rFonts w:ascii="Times New Roman" w:eastAsia="Times New Roman" w:hAnsi="Times New Roman" w:cs="Times New Roman"/>
+          <w:color w:val="000000"/>
+        </w:rPr>
+        <w:t>Pygame</w:t>
+      </w:r>
+      <w:proofErr w:type="spellEnd"/>
+      <w:r>
+        <w:rPr>
+          <w:rFonts w:ascii="Times New Roman" w:eastAsia="Times New Roman" w:hAnsi="Times New Roman" w:cs="Times New Roman"/>
+          <w:color w:val="000000"/>
+        </w:rPr>
+        <w:t>.</w:t>
       </w:r>
     </w:p>
     <w:p>
@@ -2072,7 +2238,39 @@
           <w:rFonts w:ascii="Times New Roman" w:eastAsia="Times New Roman" w:hAnsi="Times New Roman" w:cs="Times New Roman"/>
           <w:color w:val="000000"/>
         </w:rPr>
-        <w:t>Microsoft Excel, PowerPoint, VS Code, GitHub, Matlabs, NX, LTspice, Eclipse, Windows Form Applications, Unity, Photoshop, Jenkins</w:t>
+        <w:t xml:space="preserve">Microsoft Excel, PowerPoint, VS Code, GitHub, </w:t>
+      </w:r>
+      <w:proofErr w:type="spellStart"/>
+      <w:r>
+        <w:rPr>
+          <w:rFonts w:ascii="Times New Roman" w:eastAsia="Times New Roman" w:hAnsi="Times New Roman" w:cs="Times New Roman"/>
+          <w:color w:val="000000"/>
+        </w:rPr>
+        <w:t>Matlabs</w:t>
+      </w:r>
+      <w:proofErr w:type="spellEnd"/>
+      <w:r>
+        <w:rPr>
+          <w:rFonts w:ascii="Times New Roman" w:eastAsia="Times New Roman" w:hAnsi="Times New Roman" w:cs="Times New Roman"/>
+          <w:color w:val="000000"/>
+        </w:rPr>
+        <w:t xml:space="preserve">, NX, </w:t>
+      </w:r>
+      <w:proofErr w:type="spellStart"/>
+      <w:r>
+        <w:rPr>
+          <w:rFonts w:ascii="Times New Roman" w:eastAsia="Times New Roman" w:hAnsi="Times New Roman" w:cs="Times New Roman"/>
+          <w:color w:val="000000"/>
+        </w:rPr>
+        <w:t>LTspice</w:t>
+      </w:r>
+      <w:proofErr w:type="spellEnd"/>
+      <w:r>
+        <w:rPr>
+          <w:rFonts w:ascii="Times New Roman" w:eastAsia="Times New Roman" w:hAnsi="Times New Roman" w:cs="Times New Roman"/>
+          <w:color w:val="000000"/>
+        </w:rPr>
+        <w:t>, Eclipse, Windows Form Applications, Unity, Photoshop, Jenkins</w:t>
       </w:r>
       <w:r>
         <w:rPr>

</xml_diff>

<commit_message>
fix to resume and changed universal image to random image generator
</commit_message>
<xml_diff>
--- a/src/assets/Resume25-26.docx
+++ b/src/assets/Resume25-26.docx
@@ -23,16 +23,16 @@
         <mc:AlternateContent>
           <mc:Choice Requires="wps">
             <w:drawing>
-              <wp:anchor distT="45720" distB="45720" distL="114300" distR="114300" simplePos="0" relativeHeight="251661312" behindDoc="1" locked="0" layoutInCell="1" allowOverlap="1" wp14:anchorId="6DAF7578" wp14:editId="699426FE">
+              <wp:anchor distT="45720" distB="45720" distL="114300" distR="114300" simplePos="0" relativeHeight="251661312" behindDoc="1" locked="0" layoutInCell="1" allowOverlap="1" wp14:anchorId="6DAF7578" wp14:editId="3FA57520">
                 <wp:simplePos x="0" y="0"/>
                 <wp:positionH relativeFrom="margin">
-                  <wp:posOffset>4120987</wp:posOffset>
+                  <wp:posOffset>3697941</wp:posOffset>
                 </wp:positionH>
                 <wp:positionV relativeFrom="paragraph">
-                  <wp:posOffset>-267723</wp:posOffset>
+                  <wp:posOffset>-266700</wp:posOffset>
                 </wp:positionV>
-                <wp:extent cx="1889760" cy="701040"/>
-                <wp:effectExtent l="0" t="0" r="15240" b="22860"/>
+                <wp:extent cx="2313343" cy="701040"/>
+                <wp:effectExtent l="0" t="0" r="10795" b="22860"/>
                 <wp:wrapNone/>
                 <wp:docPr id="217" name="Text Box 2"/>
                 <wp:cNvGraphicFramePr>
@@ -47,7 +47,7 @@
                       <wps:spPr bwMode="auto">
                         <a:xfrm>
                           <a:off x="0" y="0"/>
-                          <a:ext cx="1889760" cy="701040"/>
+                          <a:ext cx="2313343" cy="701040"/>
                         </a:xfrm>
                         <a:prstGeom prst="rect">
                           <a:avLst/>
@@ -76,19 +76,56 @@
                                 <w:szCs w:val="20"/>
                               </w:rPr>
                             </w:pPr>
-                            <w:hyperlink r:id="rId5" w:history="1">
-                              <w:r>
-                                <w:rPr>
-                                  <w:rStyle w:val="Hyperlink"/>
-                                  <w:rFonts w:ascii="Times New Roman" w:hAnsi="Times New Roman" w:cs="Times New Roman"/>
-                                  <w:color w:val="000000" w:themeColor="text1"/>
-                                  <w:sz w:val="20"/>
-                                  <w:szCs w:val="20"/>
-                                  <w:u w:val="none"/>
-                                </w:rPr>
-                                <w:t>tjlayton2@gmail.com</w:t>
-                              </w:r>
-                            </w:hyperlink>
+                            <w:r>
+                              <w:rPr>
+                                <w:rFonts w:ascii="Times New Roman" w:hAnsi="Times New Roman" w:cs="Times New Roman"/>
+                                <w:sz w:val="20"/>
+                                <w:szCs w:val="20"/>
+                              </w:rPr>
+                              <w:fldChar w:fldCharType="begin"/>
+                            </w:r>
+                            <w:r>
+                              <w:rPr>
+                                <w:rFonts w:ascii="Times New Roman" w:hAnsi="Times New Roman" w:cs="Times New Roman"/>
+                                <w:sz w:val="20"/>
+                                <w:szCs w:val="20"/>
+                              </w:rPr>
+                              <w:instrText>HYPERLINK "mailto:tjlayton2@gmail.com"</w:instrText>
+                            </w:r>
+                            <w:r>
+                              <w:rPr>
+                                <w:rFonts w:ascii="Times New Roman" w:hAnsi="Times New Roman" w:cs="Times New Roman"/>
+                                <w:sz w:val="20"/>
+                                <w:szCs w:val="20"/>
+                              </w:rPr>
+                            </w:r>
+                            <w:r>
+                              <w:rPr>
+                                <w:rFonts w:ascii="Times New Roman" w:hAnsi="Times New Roman" w:cs="Times New Roman"/>
+                                <w:sz w:val="20"/>
+                                <w:szCs w:val="20"/>
+                              </w:rPr>
+                              <w:fldChar w:fldCharType="separate"/>
+                            </w:r>
+                            <w:r>
+                              <w:rPr>
+                                <w:rStyle w:val="Hyperlink"/>
+                                <w:rFonts w:ascii="Times New Roman" w:hAnsi="Times New Roman" w:cs="Times New Roman"/>
+                                <w:color w:val="000000" w:themeColor="text1"/>
+                                <w:sz w:val="20"/>
+                                <w:szCs w:val="20"/>
+                                <w:u w:val="none"/>
+                              </w:rPr>
+                              <w:t>tjlayton2@gmail.com</w:t>
+                            </w:r>
+                            <w:r>
+                              <w:rPr>
+                                <w:rFonts w:ascii="Times New Roman" w:hAnsi="Times New Roman" w:cs="Times New Roman"/>
+                                <w:sz w:val="20"/>
+                                <w:szCs w:val="20"/>
+                              </w:rPr>
+                              <w:fldChar w:fldCharType="end"/>
+                            </w:r>
                             <w:r>
                               <w:rPr>
                                 <w:rFonts w:ascii="Times New Roman" w:hAnsi="Times New Roman" w:cs="Times New Roman"/>
@@ -96,7 +133,17 @@
                                 <w:sz w:val="20"/>
                                 <w:szCs w:val="20"/>
                               </w:rPr>
-                              <w:t xml:space="preserve">                           </w:t>
+                              <w:t xml:space="preserve">                        </w:t>
+                            </w:r>
+                            <w:proofErr w:type="gramStart"/>
+                            <w:r>
+                              <w:rPr>
+                                <w:rFonts w:ascii="Times New Roman" w:hAnsi="Times New Roman" w:cs="Times New Roman"/>
+                                <w:color w:val="000000" w:themeColor="text1"/>
+                                <w:sz w:val="20"/>
+                                <w:szCs w:val="20"/>
+                              </w:rPr>
+                              <w:t xml:space="preserve">   </w:t>
                             </w:r>
                             <w:r>
                               <w:rPr>
@@ -107,6 +154,7 @@
                               </w:rPr>
                               <w:t>(</w:t>
                             </w:r>
+                            <w:proofErr w:type="gramEnd"/>
                             <w:r>
                               <w:rPr>
                                 <w:rFonts w:ascii="Times New Roman" w:hAnsi="Times New Roman" w:cs="Times New Roman"/>
@@ -141,18 +189,18 @@
                                 <w:sz w:val="20"/>
                                 <w:szCs w:val="20"/>
                               </w:rPr>
-                              <w:t xml:space="preserve">           </w:t>
+                              <w:t xml:space="preserve">    </w:t>
                             </w:r>
-                            <w:hyperlink r:id="rId6" w:history="1">
+                            <w:hyperlink r:id="rId5" w:history="1">
                               <w:r>
                                 <w:rPr>
                                   <w:rStyle w:val="Hyperlink"/>
                                   <w:rFonts w:ascii="Times New Roman" w:hAnsi="Times New Roman" w:cs="Times New Roman"/>
-                                  <w:color w:val="000000"/>
+                                  <w:color w:val="000000" w:themeColor="text1"/>
                                   <w:sz w:val="20"/>
                                   <w:szCs w:val="20"/>
                                 </w:rPr>
-                                <w:t>Linkedin: tyler-layton977a38249</w:t>
+                                <w:t>linkedin.com/in/tyler-layton-977a38249</w:t>
                               </w:r>
                             </w:hyperlink>
                           </w:p>
@@ -166,7 +214,7 @@
                                 <w:szCs w:val="20"/>
                               </w:rPr>
                             </w:pPr>
-                            <w:hyperlink r:id="rId7" w:history="1">
+                            <w:hyperlink r:id="rId6" w:history="1">
                               <w:r>
                                 <w:rPr>
                                   <w:rStyle w:val="Hyperlink"/>
@@ -175,7 +223,7 @@
                                   <w:sz w:val="20"/>
                                   <w:szCs w:val="20"/>
                                 </w:rPr>
-                                <w:t>Website: tjlayton.com</w:t>
+                                <w:t>tjlayton.com</w:t>
                               </w:r>
                             </w:hyperlink>
                           </w:p>
@@ -211,7 +259,7 @@
                 <v:stroke joinstyle="miter"/>
                 <v:path gradientshapeok="t" o:connecttype="rect"/>
               </v:shapetype>
-              <v:shape id="Text Box 2" o:spid="_x0000_s1026" type="#_x0000_t202" style="position:absolute;margin-left:324.5pt;margin-top:-21.1pt;width:148.8pt;height:55.2pt;z-index:-251655168;visibility:visible;mso-wrap-style:square;mso-width-percent:0;mso-height-percent:0;mso-wrap-distance-left:9pt;mso-wrap-distance-top:3.6pt;mso-wrap-distance-right:9pt;mso-wrap-distance-bottom:3.6pt;mso-position-horizontal:absolute;mso-position-horizontal-relative:margin;mso-position-vertical:absolute;mso-position-vertical-relative:text;mso-width-percent:0;mso-height-percent:0;mso-width-relative:margin;mso-height-relative:margin;v-text-anchor:top" o:gfxdata="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" strokecolor="white [3212]">
+              <v:shape id="Text Box 2" o:spid="_x0000_s1026" type="#_x0000_t202" style="position:absolute;margin-left:291.2pt;margin-top:-21pt;width:182.15pt;height:55.2pt;z-index:-251655168;visibility:visible;mso-wrap-style:square;mso-width-percent:0;mso-height-percent:0;mso-wrap-distance-left:9pt;mso-wrap-distance-top:3.6pt;mso-wrap-distance-right:9pt;mso-wrap-distance-bottom:3.6pt;mso-position-horizontal:absolute;mso-position-horizontal-relative:margin;mso-position-vertical:absolute;mso-position-vertical-relative:text;mso-width-percent:0;mso-height-percent:0;mso-width-relative:margin;mso-height-relative:margin;v-text-anchor:top" o:gfxdata="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" strokecolor="white [3212]">
                 <v:textbox>
                   <w:txbxContent>
                     <w:p>
@@ -225,12 +273,34 @@
                         </w:rPr>
                       </w:pPr>
                       <w:r>
+                        <w:rPr>
+                          <w:rFonts w:ascii="Times New Roman" w:hAnsi="Times New Roman" w:cs="Times New Roman"/>
+                          <w:sz w:val="20"/>
+                          <w:szCs w:val="20"/>
+                        </w:rPr>
                         <w:fldChar w:fldCharType="begin"/>
                       </w:r>
                       <w:r>
+                        <w:rPr>
+                          <w:rFonts w:ascii="Times New Roman" w:hAnsi="Times New Roman" w:cs="Times New Roman"/>
+                          <w:sz w:val="20"/>
+                          <w:szCs w:val="20"/>
+                        </w:rPr>
                         <w:instrText>HYPERLINK "mailto:tjlayton2@gmail.com"</w:instrText>
                       </w:r>
                       <w:r>
+                        <w:rPr>
+                          <w:rFonts w:ascii="Times New Roman" w:hAnsi="Times New Roman" w:cs="Times New Roman"/>
+                          <w:sz w:val="20"/>
+                          <w:szCs w:val="20"/>
+                        </w:rPr>
+                      </w:r>
+                      <w:r>
+                        <w:rPr>
+                          <w:rFonts w:ascii="Times New Roman" w:hAnsi="Times New Roman" w:cs="Times New Roman"/>
+                          <w:sz w:val="20"/>
+                          <w:szCs w:val="20"/>
+                        </w:rPr>
                         <w:fldChar w:fldCharType="separate"/>
                       </w:r>
                       <w:r>
@@ -245,6 +315,11 @@
                         <w:t>tjlayton2@gmail.com</w:t>
                       </w:r>
                       <w:r>
+                        <w:rPr>
+                          <w:rFonts w:ascii="Times New Roman" w:hAnsi="Times New Roman" w:cs="Times New Roman"/>
+                          <w:sz w:val="20"/>
+                          <w:szCs w:val="20"/>
+                        </w:rPr>
                         <w:fldChar w:fldCharType="end"/>
                       </w:r>
                       <w:r>
@@ -254,7 +329,17 @@
                           <w:sz w:val="20"/>
                           <w:szCs w:val="20"/>
                         </w:rPr>
-                        <w:t xml:space="preserve">                           </w:t>
+                        <w:t xml:space="preserve">                        </w:t>
+                      </w:r>
+                      <w:proofErr w:type="gramStart"/>
+                      <w:r>
+                        <w:rPr>
+                          <w:rFonts w:ascii="Times New Roman" w:hAnsi="Times New Roman" w:cs="Times New Roman"/>
+                          <w:color w:val="000000" w:themeColor="text1"/>
+                          <w:sz w:val="20"/>
+                          <w:szCs w:val="20"/>
+                        </w:rPr>
+                        <w:t xml:space="preserve">   </w:t>
                       </w:r>
                       <w:r>
                         <w:rPr>
@@ -265,6 +350,7 @@
                         </w:rPr>
                         <w:t>(</w:t>
                       </w:r>
+                      <w:proofErr w:type="gramEnd"/>
                       <w:r>
                         <w:rPr>
                           <w:rFonts w:ascii="Times New Roman" w:hAnsi="Times New Roman" w:cs="Times New Roman"/>
@@ -299,30 +385,18 @@
                           <w:sz w:val="20"/>
                           <w:szCs w:val="20"/>
                         </w:rPr>
-                        <w:t xml:space="preserve">           </w:t>
+                        <w:t xml:space="preserve">    </w:t>
                       </w:r>
-                      <w:hyperlink r:id="rId8" w:history="1">
-                        <w:proofErr w:type="spellStart"/>
+                      <w:hyperlink r:id="rId7" w:history="1">
                         <w:r>
                           <w:rPr>
                             <w:rStyle w:val="Hyperlink"/>
                             <w:rFonts w:ascii="Times New Roman" w:hAnsi="Times New Roman" w:cs="Times New Roman"/>
-                            <w:color w:val="000000"/>
+                            <w:color w:val="000000" w:themeColor="text1"/>
                             <w:sz w:val="20"/>
                             <w:szCs w:val="20"/>
                           </w:rPr>
-                          <w:t>Linkedin</w:t>
-                        </w:r>
-                        <w:proofErr w:type="spellEnd"/>
-                        <w:r>
-                          <w:rPr>
-                            <w:rStyle w:val="Hyperlink"/>
-                            <w:rFonts w:ascii="Times New Roman" w:hAnsi="Times New Roman" w:cs="Times New Roman"/>
-                            <w:color w:val="000000"/>
-                            <w:sz w:val="20"/>
-                            <w:szCs w:val="20"/>
-                          </w:rPr>
-                          <w:t>: tyler-layton977a38249</w:t>
+                          <w:t>linkedin.com/in/tyler-layton-977a38249</w:t>
                         </w:r>
                       </w:hyperlink>
                     </w:p>
@@ -336,7 +410,7 @@
                           <w:szCs w:val="20"/>
                         </w:rPr>
                       </w:pPr>
-                      <w:hyperlink r:id="rId9" w:history="1">
+                      <w:hyperlink r:id="rId8" w:history="1">
                         <w:r>
                           <w:rPr>
                             <w:rStyle w:val="Hyperlink"/>
@@ -345,7 +419,7 @@
                             <w:sz w:val="20"/>
                             <w:szCs w:val="20"/>
                           </w:rPr>
-                          <w:t>Website: tjlayton.com</w:t>
+                          <w:t>tjlayton.com</w:t>
                         </w:r>
                       </w:hyperlink>
                     </w:p>
@@ -945,31 +1019,7 @@
                 <w:sz w:val="24"/>
                 <w:szCs w:val="24"/>
               </w:rPr>
-              <w:t xml:space="preserve">May 2025 </w:t>
-            </w:r>
-            <w:r>
-              <w:rPr>
-                <w:rFonts w:ascii="Times New Roman" w:eastAsia="Times New Roman" w:hAnsi="Times New Roman" w:cs="Times New Roman"/>
-                <w:b/>
-                <w:bCs/>
-                <w:color w:val="000000"/>
-                <w:kern w:val="36"/>
-                <w:sz w:val="24"/>
-                <w:szCs w:val="24"/>
-              </w:rPr>
-              <w:t>–</w:t>
-            </w:r>
-            <w:r>
-              <w:rPr>
-                <w:rFonts w:ascii="Times New Roman" w:eastAsia="Times New Roman" w:hAnsi="Times New Roman" w:cs="Times New Roman"/>
-                <w:b/>
-                <w:bCs/>
-                <w:color w:val="000000"/>
-                <w:kern w:val="36"/>
-                <w:sz w:val="24"/>
-                <w:szCs w:val="24"/>
-              </w:rPr>
-              <w:t xml:space="preserve"> May 2026</w:t>
+              <w:t>May 2025 – May 2026</w:t>
             </w:r>
           </w:p>
         </w:tc>
@@ -1088,7 +1138,7 @@
           <w:color w:val="000000"/>
           <w:kern w:val="36"/>
         </w:rPr>
-        <w:t xml:space="preserve"> web application for 2D network visualization, enabling users to create, customize, and analyze large graphs with search algorithms such as DFS, BFS, Dijkstra’s,</w:t>
+        <w:t xml:space="preserve"> web application for 2D network visualization, enabling users to create, customize, and analyze large graphs with search algorithms such as DFS, BFS,</w:t>
       </w:r>
       <w:r>
         <w:rPr>
@@ -1096,7 +1146,23 @@
           <w:color w:val="000000"/>
           <w:kern w:val="36"/>
         </w:rPr>
-        <w:t xml:space="preserve"> etc.</w:t>
+        <w:t xml:space="preserve"> and</w:t>
+      </w:r>
+      <w:r>
+        <w:rPr>
+          <w:rFonts w:ascii="Times New Roman" w:eastAsia="Times New Roman" w:hAnsi="Times New Roman" w:cs="Times New Roman"/>
+          <w:color w:val="000000"/>
+          <w:kern w:val="36"/>
+        </w:rPr>
+        <w:t xml:space="preserve"> Dijkstra’s</w:t>
+      </w:r>
+      <w:r>
+        <w:rPr>
+          <w:rFonts w:ascii="Times New Roman" w:eastAsia="Times New Roman" w:hAnsi="Times New Roman" w:cs="Times New Roman"/>
+          <w:color w:val="000000"/>
+          <w:kern w:val="36"/>
+        </w:rPr>
+        <w:t>.</w:t>
       </w:r>
     </w:p>
     <w:tbl>
@@ -1183,31 +1249,7 @@
                 <w:sz w:val="24"/>
                 <w:szCs w:val="24"/>
               </w:rPr>
-              <w:t>January</w:t>
-            </w:r>
-            <w:r>
-              <w:rPr>
-                <w:rFonts w:ascii="Times New Roman" w:eastAsia="Times New Roman" w:hAnsi="Times New Roman" w:cs="Times New Roman"/>
-                <w:b/>
-                <w:bCs/>
-                <w:color w:val="000000"/>
-                <w:kern w:val="36"/>
-                <w:sz w:val="24"/>
-                <w:szCs w:val="24"/>
-              </w:rPr>
-              <w:t xml:space="preserve"> 2025 – May 202</w:t>
-            </w:r>
-            <w:r>
-              <w:rPr>
-                <w:rFonts w:ascii="Times New Roman" w:eastAsia="Times New Roman" w:hAnsi="Times New Roman" w:cs="Times New Roman"/>
-                <w:b/>
-                <w:bCs/>
-                <w:color w:val="000000"/>
-                <w:kern w:val="36"/>
-                <w:sz w:val="24"/>
-                <w:szCs w:val="24"/>
-              </w:rPr>
-              <w:t>5</w:t>
+              <w:t>January 2025 – May 2025</w:t>
             </w:r>
           </w:p>
         </w:tc>
@@ -1677,7 +1719,25 @@
           <w:color w:val="000000"/>
           <w:kern w:val="36"/>
         </w:rPr>
-        <w:t xml:space="preserve"> in Python with Tkinter for creating and managing Jenkins files, reducing file authoring time by 80%.</w:t>
+        <w:t xml:space="preserve"> in Python with </w:t>
+      </w:r>
+      <w:proofErr w:type="spellStart"/>
+      <w:r>
+        <w:rPr>
+          <w:rFonts w:ascii="Times New Roman" w:eastAsia="Times New Roman" w:hAnsi="Times New Roman" w:cs="Times New Roman"/>
+          <w:color w:val="000000"/>
+          <w:kern w:val="36"/>
+        </w:rPr>
+        <w:t>Tkinter</w:t>
+      </w:r>
+      <w:proofErr w:type="spellEnd"/>
+      <w:r>
+        <w:rPr>
+          <w:rFonts w:ascii="Times New Roman" w:eastAsia="Times New Roman" w:hAnsi="Times New Roman" w:cs="Times New Roman"/>
+          <w:color w:val="000000"/>
+          <w:kern w:val="36"/>
+        </w:rPr>
+        <w:t xml:space="preserve"> for creating and managing Jenkins files, reducing file authoring time by 80%.</w:t>
       </w:r>
     </w:p>
     <w:p>
@@ -1773,19 +1833,7 @@
                 <w:sz w:val="24"/>
                 <w:szCs w:val="24"/>
               </w:rPr>
-              <w:t>Frontend Engi</w:t>
-            </w:r>
-            <w:r>
-              <w:rPr>
-                <w:rFonts w:ascii="Times New Roman" w:eastAsia="Times New Roman" w:hAnsi="Times New Roman" w:cs="Times New Roman"/>
-                <w:b/>
-                <w:bCs/>
-                <w:color w:val="000000"/>
-                <w:kern w:val="36"/>
-                <w:sz w:val="24"/>
-                <w:szCs w:val="24"/>
-              </w:rPr>
-              <w:t>neer/Project Lead Developer</w:t>
+              <w:t>Frontend Engineer/Project Lead Developer</w:t>
             </w:r>
           </w:p>
         </w:tc>
@@ -1914,7 +1962,23 @@
           <w:rFonts w:ascii="Times New Roman" w:eastAsia="Times New Roman" w:hAnsi="Times New Roman" w:cs="Times New Roman"/>
           <w:color w:val="000000"/>
         </w:rPr>
-        <w:t>Led and contributed to open-source projects supporting student learning, including an educational analog circuit simulator and a Python-based platformer game using Pygame.</w:t>
+        <w:t xml:space="preserve">Led and contributed to open-source projects supporting student learning, including an educational analog circuit simulator and a Python-based platformer game using </w:t>
+      </w:r>
+      <w:proofErr w:type="spellStart"/>
+      <w:r>
+        <w:rPr>
+          <w:rFonts w:ascii="Times New Roman" w:eastAsia="Times New Roman" w:hAnsi="Times New Roman" w:cs="Times New Roman"/>
+          <w:color w:val="000000"/>
+        </w:rPr>
+        <w:t>Pygame</w:t>
+      </w:r>
+      <w:proofErr w:type="spellEnd"/>
+      <w:r>
+        <w:rPr>
+          <w:rFonts w:ascii="Times New Roman" w:eastAsia="Times New Roman" w:hAnsi="Times New Roman" w:cs="Times New Roman"/>
+          <w:color w:val="000000"/>
+        </w:rPr>
+        <w:t>.</w:t>
       </w:r>
     </w:p>
     <w:p>
@@ -2195,7 +2259,23 @@
           <w:rFonts w:ascii="Times New Roman" w:eastAsia="Times New Roman" w:hAnsi="Times New Roman" w:cs="Times New Roman"/>
           <w:color w:val="000000"/>
         </w:rPr>
-        <w:t>, NX, LTspice, Eclipse, Windows Form Applications, Unity, Photoshop, Jenkins</w:t>
+        <w:t xml:space="preserve">, NX, </w:t>
+      </w:r>
+      <w:proofErr w:type="spellStart"/>
+      <w:r>
+        <w:rPr>
+          <w:rFonts w:ascii="Times New Roman" w:eastAsia="Times New Roman" w:hAnsi="Times New Roman" w:cs="Times New Roman"/>
+          <w:color w:val="000000"/>
+        </w:rPr>
+        <w:t>LTspice</w:t>
+      </w:r>
+      <w:proofErr w:type="spellEnd"/>
+      <w:r>
+        <w:rPr>
+          <w:rFonts w:ascii="Times New Roman" w:eastAsia="Times New Roman" w:hAnsi="Times New Roman" w:cs="Times New Roman"/>
+          <w:color w:val="000000"/>
+        </w:rPr>
+        <w:t>, Eclipse, Windows Form Applications, Unity, Photoshop, Jenkins</w:t>
       </w:r>
       <w:r>
         <w:rPr>

</xml_diff>